<commit_message>
Correct exoskeleton and 5-bar robot descriptions in LJM application
Co-Authored-By: Claude Opus 5.5 <noreply@anthropic.com>
Claude-Session: https://claude.ai/code/session_01NjdMuB9buEkMmyf7HkyEWg
</commit_message>
<xml_diff>
--- a/applications/LJM_Lind_Jensen_Mechanical_Mechatronics_Engineer/Arunabha_Majumder_Cover_Letter_LJM_Mechanical_Mechatronics_Engineer.docx
+++ b/applications/LJM_Lind_Jensen_Mechanical_Mechatronics_Engineer/Arunabha_Majumder_Cover_Letter_LJM_Mechanical_Mechatronics_Engineer.docx
@@ -147,7 +147,7 @@
           <w:b w:val="0"/>
           <w:i w:val="0"/>
         </w:rPr>
-        <w:t>In my PhD, I developed a new operating principle for a wearable machine: a parallel spring working together with a small 6 Nm motor. I created the 3D models, assemblies and drawings in SolidWorks, used component-level FEA to optimise for strength, stiffness and weight, built the prototypes hands-on and integrated the motor, sensors and control. The concept cut energy consumption by more than 25% and won the Best Paper Award at IFToMM ISRM 2026. You can see the project at www.viexo.aau.dk.</w:t>
+        <w:t>In my PhD, I developed a new hybrid actuation principle for a shoulder exoskeleton: a parallel spring working together with a small 6 Nm motor. I created the 3D models, assemblies and drawings in SolidWorks, used component-level FEA to optimise for strength, stiffness and weight, built the prototypes hands-on and integrated the motor, sensors and control. The concept cut energy consumption by more than 25% and won the Best Paper Award at IFToMM ISRM 2026. You can see the project at www.viexo.aau.dk.</w:t>
       </w:r>
     </w:p>
     <w:p>
@@ -159,7 +159,7 @@
           <w:b w:val="0"/>
           <w:i w:val="0"/>
         </w:rPr>
-        <w:t>I work systematically with testing and documentation. I design my own test rigs, validated my stiffness models against hardware to within 10% RMS error, and planned, ran, analysed and documented a 12-participant test campaign across several operating modes and load conditions.</w:t>
+        <w:t>I work systematically with testing and documentation. On a 5-bar planar parallel robot, I used the variable-stiffness actuators to estimate the force at the end effector through the robot's Jacobian, and validated the estimate against a force sensor to within 10% RMS error. I also design my own test rigs, and I planned, ran, analysed and documented a 12-participant test campaign across several operating modes and load conditions.</w:t>
       </w:r>
     </w:p>
     <w:p>

</xml_diff>